<commit_message>
report: maturity grid + §2.2 heading clarification + 20px colophon gap
Add an at-a-glance maturity grid (condensed Appendix A) after the Part 2
intro, on its own single page in HTML/PDF/Word. Clarify the §2.2 heading as
"Responsible use in practice (four AI-use modes)" so the search/co-author/
validator/tutor modes are signposted. Tighten the colophon gap below the
cover band (48px -> 20px). Lead-author's report.docx (table colour + row and
bottom lines) used verbatim; docs/ Pages site regenerated.

Co-Authored-By: Claude Opus 4.8 (1M context) <noreply@anthropic.com>
</commit_message>
<xml_diff>
--- a/final/reference.docx
+++ b/final/reference.docx
@@ -12491,6 +12491,19 @@
       <w:rFonts w:ascii="Source Serif 4" w:hAnsi="Source Serif 4"/>
       <w:color w:val="212529"/>
       <w:sz w:val="22"/>
+    </w:rPr>
+  </w:style>
+  <w:style w:type="paragraph" w:customStyle="1" w:styleId="TableText">
+    <w:rFonts w:ascii="Source Serif 4" w:hAnsi="Source Serif 4" w:cs="Source Serif 4"/>
+    <w:name w:val="TableText"/>
+    <w:basedOn w:val="Normal"/>
+    <w:pPr>
+      <w:spacing w:before="40" w:after="40" w:line="278" w:lineRule="auto"/>
+    </w:pPr>
+    <w:rPr>
+      <w:rFonts w:ascii="Source Serif 4" w:hAnsi="Source Serif 4"/>
+      <w:color w:val="212529"/>
+      <w:sz w:val="18"/>
     </w:rPr>
   </w:style>
   <w:style w:type="paragraph" w:customStyle="1" w:styleId="FootnoteText">

</xml_diff>